<commit_message>
docs(hyperv): add ADR-006, REQ-BDR-05, US-05, and FDD autoscaling for elastic ready-state replenishment
</commit_message>
<xml_diff>
--- a/docs/hyperv/architecture/docx/ADR_Enterprise_Architecture-v2.docx
+++ b/docs/hyperv/architecture/docx/ADR_Enterprise_Architecture-v2.docx
@@ -839,6 +839,168 @@
         <w:spacing w:after="120"/>
       </w:pPr>
     </w:p>
+    <w:p>
+      <w:pPr>
+        <w:keepNext/>
+        <w:spacing w:before="320" w:after="120"/>
+      </w:pPr>
+      <w:r>
+        <w:rPr>
+          <w:rFonts w:ascii="Calibri" w:hAnsi="Calibri"/>
+          <w:b/>
+          <w:color w:val="1F4E79"/>
+          <w:sz w:val="30"/>
+        </w:rPr>
+        <w:t>ADR-006: Dynamic Watermark-Based Standby Pool Autoscaling &amp; Predictive Warm-Up</w:t>
+      </w:r>
+    </w:p>
+    <w:p>
+      <w:pPr>
+        <w:spacing w:before="0" w:after="120" w:line="276" w:lineRule="auto"/>
+      </w:pPr>
+      <w:r>
+        <w:rPr>
+          <w:rFonts w:ascii="Calibri" w:hAnsi="Calibri"/>
+          <w:b/>
+          <w:color w:val="282828"/>
+          <w:sz w:val="21"/>
+        </w:rPr>
+        <w:t xml:space="preserve">Metadata: </w:t>
+      </w:r>
+      <w:r>
+        <w:rPr>
+          <w:rFonts w:ascii="Calibri" w:hAnsi="Calibri"/>
+          <w:color w:val="333333"/>
+          <w:sz w:val="21"/>
+        </w:rPr>
+        <w:t>Accepted | Date: October 2026 | Deciders: Systems Architecture Team</w:t>
+      </w:r>
+    </w:p>
+    <w:p>
+      <w:pPr>
+        <w:spacing w:before="0" w:after="120" w:line="276" w:lineRule="auto"/>
+      </w:pPr>
+      <w:r>
+        <w:rPr>
+          <w:rFonts w:ascii="Calibri" w:hAnsi="Calibri"/>
+          <w:b/>
+          <w:color w:val="282828"/>
+          <w:sz w:val="21"/>
+        </w:rPr>
+        <w:t xml:space="preserve">Context: </w:t>
+      </w:r>
+      <w:r>
+        <w:rPr>
+          <w:rFonts w:ascii="Calibri" w:hAnsi="Calibri"/>
+          <w:color w:val="333333"/>
+          <w:sz w:val="21"/>
+        </w:rPr>
+        <w:t>While maintaining a single dormant instance in Paused RAM achieves sub-300ms wake-up for a single request, a burst of concurrent requests or high-volume batch processing for ADPA/SIDPA could exhaust the standby capacity. If the solitary warm instance is leased, the next simultaneous client request would either wait in a queue or trigger an unbuffered cold provision. Production systems require elastic, proactive ready-state replenishment so multiple warm instances are immediately available whenever demand indicators surge.</w:t>
+      </w:r>
+    </w:p>
+    <w:p>
+      <w:pPr>
+        <w:spacing w:before="0" w:after="120" w:line="276" w:lineRule="auto"/>
+      </w:pPr>
+      <w:r>
+        <w:rPr>
+          <w:rFonts w:ascii="Calibri" w:hAnsi="Calibri"/>
+          <w:b/>
+          <w:color w:val="282828"/>
+          <w:sz w:val="21"/>
+        </w:rPr>
+        <w:t xml:space="preserve">Decision &amp; Mechanism: </w:t>
+      </w:r>
+      <w:r>
+        <w:rPr>
+          <w:rFonts w:ascii="Calibri" w:hAnsi="Calibri"/>
+          <w:color w:val="333333"/>
+          <w:sz w:val="21"/>
+        </w:rPr>
+        <w:t>Implement an Adaptive Low/High Watermark Standby Pool Manager with proactive replenishment and predictive event-driven scaling: (1) Immediate Standby Replenishment (Low Watermark Kmin &gt;= 1), promoting the next standby VM upon lease; (2) Surge Velocity &amp; Queue Depth Autoscaling (High Watermark Kmax up to 5-10); (3) Requirement &amp; Schedule-Driven Pre-Warming via API; (4) Dynamic Cooldown &amp; Graceful Reaping past inactivity threshold.</w:t>
+      </w:r>
+    </w:p>
+    <w:p>
+      <w:pPr>
+        <w:spacing w:before="0" w:after="120" w:line="276" w:lineRule="auto"/>
+      </w:pPr>
+      <w:r>
+        <w:rPr>
+          <w:rFonts w:ascii="Calibri" w:hAnsi="Calibri"/>
+          <w:b/>
+          <w:color w:val="282828"/>
+          <w:sz w:val="21"/>
+        </w:rPr>
+        <w:t xml:space="preserve">Consequences: </w:t>
+      </w:r>
+      <w:r>
+        <w:rPr>
+          <w:rFonts w:ascii="Calibri" w:hAnsi="Calibri"/>
+          <w:color w:val="333333"/>
+          <w:sz w:val="21"/>
+        </w:rPr>
+        <w:t>Positive: Seamless multi-tenant concurrency handling with zero queuing delay during traffic spikes; zero cold-boot delays even under burst conditions; predictable memory overhead bounded by Kmax. Trade-off: Burst expansion momentarily consumes additional host RAM (~1.2GB per additional paused instance), automatically released upon idle cooldown via Dynamic Memory.</w:t>
+      </w:r>
+    </w:p>
+    <w:tbl>
+      <w:tblPr>
+        <w:tblW w:type="auto" w:w="0"/>
+        <w:jc w:val="center"/>
+        <w:tblLook w:firstColumn="1" w:firstRow="1" w:lastColumn="0" w:lastRow="0" w:noHBand="0" w:noVBand="1" w:val="04A0"/>
+      </w:tblPr>
+      <w:tblGrid>
+        <w:gridCol w:w="9792"/>
+      </w:tblGrid>
+      <w:tr>
+        <w:tc>
+          <w:tcPr>
+            <w:tcW w:type="dxa" w:w="9792"/>
+            <w:shd w:fill="F2F4F7"/>
+            <w:tcMar>
+              <w:top w:w="120" w:type="dxa"/>
+              <w:bottom w:w="120" w:type="dxa"/>
+              <w:left w:w="180" w:type="dxa"/>
+              <w:right w:w="180" w:type="dxa"/>
+            </w:tcMar>
+            <w:tcBorders>
+              <w:left w:val="single" w:sz="24" w:space="0" w:color="1F4E79"/>
+              <w:top w:val="none"/>
+              <w:right w:val="none"/>
+              <w:bottom w:val="none"/>
+            </w:tcBorders>
+          </w:tcPr>
+          <w:p>
+            <w:pPr>
+              <w:spacing w:before="40" w:after="40" w:line="276" w:lineRule="auto"/>
+            </w:pPr>
+            <w:r>
+              <w:rPr>
+                <w:rFonts w:ascii="Calibri" w:hAnsi="Calibri"/>
+                <w:b/>
+                <w:color w:val="1F4E79"/>
+                <w:sz w:val="20"/>
+              </w:rPr>
+              <w:t>FUTURE HORIZON &amp; SCALING ENHANCEMENT:</w:t>
+              <w:br/>
+            </w:r>
+            <w:r>
+              <w:rPr>
+                <w:rFonts w:ascii="Calibri" w:hAnsi="Calibri"/>
+                <w:i/>
+                <w:color w:val="464646"/>
+                <w:sz w:val="20"/>
+              </w:rPr>
+              <w:t>AI-Driven Predictive Ingress Forecasting: Train an on-host lightweight time-series model (e.g., ARIMA or temporal transformer) analyzing historical request telemetry to automatically pre-warm pools 60 seconds ahead of anticipated demand cycles with zero manual scheduling.</w:t>
+            </w:r>
+          </w:p>
+        </w:tc>
+      </w:tr>
+    </w:tbl>
+    <w:p>
+      <w:pPr>
+        <w:spacing w:after="120"/>
+      </w:pPr>
+    </w:p>
     <w:sectPr>
       <w:pgSz w:w="12240" w:h="15840"/>
       <w:pgMar w:top="1224" w:right="1224" w:bottom="1224" w:left="1224" w:header="720" w:footer="720" w:gutter="0"/>

</xml_diff>

<commit_message>
docs(hyperv): resolve technical contradictions in memory compaction, egress datastore whitelist, PRNG entropy, and merged docx
</commit_message>
<xml_diff>
--- a/docs/hyperv/architecture/docx/ADR_Enterprise_Architecture-v2.docx
+++ b/docs/hyperv/architecture/docx/ADR_Enterprise_Architecture-v2.docx
@@ -593,7 +593,7 @@
           <w:color w:val="333333"/>
           <w:sz w:val="21"/>
         </w:rPr>
-        <w:t>Implement the warm pool state as Hyper-V Paused Instances. When dormant, VMs remain in Hyper-V Paused state; the host hypervisor stops scheduling vCPU execution ticks (0.0% CPU usage); Dynamic Memory trims and pages unneeded working set memory; resuming via Resume-VM executes in &lt;300ms.</w:t>
+        <w:t>Implement the warm pool state as Hyper-V Paused Instances. When dormant, VMs remain in Hyper-V Paused state with instruction pointers frozen (0.0% CPU). Rather than relying on the guest balloon driver to actively reclaim memory while its vCPUs are frozen (which is impossible when paused) or forcing host swap-paging (which violates the &lt;300ms resume SLA due to disk I/O page-ins), guest memory is aggressively trimmed and compacted prior to issuing Suspend-VM during pool replenishment and image baking. This locks each dormant instance into a lean static host RAM allocation (~1.0–1.2 GB). Resuming via Resume-VM executes in &lt;300ms.</w:t>
       </w:r>
     </w:p>
     <w:p>
@@ -615,7 +615,7 @@
           <w:color w:val="333333"/>
           <w:sz w:val="21"/>
         </w:rPr>
-        <w:t>Positive: Sub-300ms wake times with 0.0% idle CPU overhead.</w:t>
+        <w:t>Positive: Guaranteed deterministic sub-300ms wake times with 0.0% idle CPU overhead. Trade-off: Requires sizing host physical RAM to accommodate K_ready warm paused instances without triggering host-level memory overcommit swap.</w:t>
       </w:r>
     </w:p>
     <w:tbl>
@@ -755,7 +755,7 @@
           <w:color w:val="333333"/>
           <w:sz w:val="21"/>
         </w:rPr>
-        <w:t>Execute all production sessions against a transient differencing disk (.avhdx) anchored to the clean production baseline. Upon session release or inactivity timeout, the differencing disk is discarded and the VM is reverted to the immutable baseline snapshot. Persistent business data is stored exclusively in external enterprise datastores (SQL Server, PostgreSQL, S3/Blob storage), guaranteeing 100% ephemeral compute.</w:t>
+        <w:t>Execute all production sessions against a transient differencing disk (.avhdx) anchored to the clean production baseline (baseline-hot-ready). All disk writes during the session are captured exclusively in the .avhdx layer and discarded upon session release. Persistent business data is stored exclusively in external enterprise datastores via an Internal Data Plane &amp; Egress Whitelist: public internet egress is strictly blocked (airgap default), while outbound traffic is permitted strictly to internal datastore subnets: TCP 1433 (SQL Server), TCP 5432 (PostgreSQL), and TCP 443 (Private S3/Blob storage endpoints).</w:t>
       </w:r>
     </w:p>
     <w:p>
@@ -777,7 +777,7 @@
           <w:color w:val="333333"/>
           <w:sz w:val="21"/>
         </w:rPr>
-        <w:t>Positive: Zero post-session state drift and guaranteed eradication of any session residue.</w:t>
+        <w:t>Positive: Zero post-session state drift, guaranteed eradication of session residue, and secure persistence to external datastores without exposing internet access.</w:t>
       </w:r>
     </w:p>
     <w:tbl>
@@ -895,7 +895,7 @@
           <w:color w:val="333333"/>
           <w:sz w:val="21"/>
         </w:rPr>
-        <w:t>While maintaining a single dormant instance in Paused RAM achieves sub-300ms wake-up for a single request, a burst of concurrent requests or high-volume batch processing for ADPA/SIDPA could exhaust the standby capacity. If the solitary warm instance is leased, the next simultaneous client request would either wait in a queue or trigger an unbuffered cold provision. Production systems require elastic, proactive ready-state replenishment so multiple warm instances are immediately available whenever demand indicators surge.</w:t>
+        <w:t>While maintaining a single dormant instance in Paused RAM achieves sub-300ms wake-up for a single request, a burst of concurrent requests or high-volume batch processing for ADPA/SIDPA could exhaust the standby capacity. Production systems require elastic, proactive ready-state replenishment so multiple warm instances are immediately available whenever demand indicators surge.</w:t>
       </w:r>
     </w:p>
     <w:p>
@@ -917,7 +917,7 @@
           <w:color w:val="333333"/>
           <w:sz w:val="21"/>
         </w:rPr>
-        <w:t>Implement an Adaptive Low/High Watermark Standby Pool Manager with proactive replenishment and predictive event-driven scaling: (1) Immediate Standby Replenishment (Low Watermark Kmin &gt;= 1), promoting the next standby VM upon lease; (2) Surge Velocity &amp; Queue Depth Autoscaling (High Watermark Kmax up to 5-10); (3) Requirement &amp; Schedule-Driven Pre-Warming via API; (4) Dynamic Cooldown &amp; Graceful Reaping past inactivity threshold.</w:t>
+        <w:t>Implement an Adaptive Low/High Watermark Standby Pool Manager with tiered lifecycle states: (1) ColdProvisioned (0MB RAM, disk provisioned on NVMe), (2) StandbyPaused (pre-warmed, pre-trimmed, paused in RAM at ~1.0–1.2 GB, &lt;300ms wake), and (3) ActiveRunning. Low Watermark Kmin maintains ready instances; when an instance is leased, an async background worker promotes a ColdProvisioned VM in ~1.5s. High Watermark Kmax dynamically expands the buffer under surge velocity. Sibling VM PRNG entropy is re-seeded from hardware (RDRAND/BCryptGenRandom) on wake, and guest clock sync against host UTC time is asserted on resume before serving requests.</w:t>
       </w:r>
     </w:p>
     <w:p>
@@ -939,7 +939,7 @@
           <w:color w:val="333333"/>
           <w:sz w:val="21"/>
         </w:rPr>
-        <w:t>Positive: Seamless multi-tenant concurrency handling with zero queuing delay during traffic spikes; zero cold-boot delays even under burst conditions; predictable memory overhead bounded by Kmax. Trade-off: Burst expansion momentarily consumes additional host RAM (~1.2GB per additional paused instance), automatically released upon idle cooldown via Dynamic Memory.</w:t>
+        <w:t>Positive: Seamless concurrency handling with zero queuing delay; zero cold boots; cryptographic security against PRNG entropy duplication; zero clock-skew authentication errors. Trade-off: Burst expansion momentarily consumes additional host RAM (~1.0–1.2 GB per paused instance), reclaimed back to disk upon idle cooldown.</w:t>
       </w:r>
     </w:p>
     <w:tbl>

</xml_diff>

<commit_message>
docs(hyperv): add connection pool purging, internal DNS/Kerberos egress, and execution safety timeouts
</commit_message>
<xml_diff>
--- a/docs/hyperv/architecture/docx/ADR_Enterprise_Architecture-v2.docx
+++ b/docs/hyperv/architecture/docx/ADR_Enterprise_Architecture-v2.docx
@@ -755,7 +755,7 @@
           <w:color w:val="333333"/>
           <w:sz w:val="21"/>
         </w:rPr>
-        <w:t>Execute all production sessions against a transient differencing disk (.avhdx) anchored to the clean production baseline (baseline-hot-ready). All disk writes during the session are captured exclusively in the .avhdx layer and discarded upon session release. Persistent business data is stored exclusively in external enterprise datastores via an Internal Data Plane &amp; Egress Whitelist: public internet egress is strictly blocked (airgap default), while outbound traffic is permitted strictly to internal datastore subnets: TCP 1433 (SQL Server), TCP 5432 (PostgreSQL), and TCP 443 (Private S3/Blob storage endpoints).</w:t>
+        <w:t>Execute all production sessions against a transient differencing disk (.avhdx) anchored to the clean production baseline (baseline-hot-ready). All disk writes during the session are captured exclusively in the .avhdx layer and discarded upon session release. Persistent business data is stored exclusively in external enterprise datastores via an Internal Data Plane &amp; Egress Whitelist: public internet egress is strictly blocked (airgap default), while outbound traffic is permitted strictly to internal datastore subnets (TCP 1433 for SQL Server, TCP 5432 for PostgreSQL, TCP 443 for Private S3/Blob storage) and directory services (UDP/TCP 53 for Internal DNS, UDP/TCP 88 for Active Directory Kerberos).</w:t>
       </w:r>
     </w:p>
     <w:p>
@@ -917,7 +917,7 @@
           <w:color w:val="333333"/>
           <w:sz w:val="21"/>
         </w:rPr>
-        <w:t>Implement an Adaptive Low/High Watermark Standby Pool Manager with tiered lifecycle states: (1) ColdProvisioned (0MB RAM, disk provisioned on NVMe), (2) StandbyPaused (pre-warmed, pre-trimmed, paused in RAM at ~1.0–1.2 GB, &lt;300ms wake), and (3) ActiveRunning. Low Watermark Kmin maintains ready instances; when an instance is leased, an async background worker promotes a ColdProvisioned VM in ~1.5s. High Watermark Kmax dynamically expands the buffer under surge velocity. Sibling VM PRNG entropy is re-seeded from hardware (RDRAND/BCryptGenRandom) on wake, and guest clock sync against host UTC time is asserted on resume before serving requests.</w:t>
+        <w:t>Implement an Adaptive Low/High Watermark Standby Pool Manager with tiered lifecycle states: (1) ColdProvisioned (0MB RAM, disk provisioned on NVMe), (2) StandbyPaused (pre-warmed, pre-trimmed, paused in RAM at ~1.0–1.2 GB, &lt;300ms wake), and (3) ActiveRunning. Low Watermark Kmin maintains ready instances; when an instance is leased, an async background worker promotes a ColdProvisioned VM in ~1.5s. High Watermark Kmax dynamically expands the buffer under surge velocity. Sibling VM PRNG entropy is re-seeded from hardware (RDRAND/BCryptGenRandom) on wake, stale database connection pools are cleared (ClearAllPools()), and guest clock sync against host UTC time is asserted on resume before serving requests.</w:t>
       </w:r>
     </w:p>
     <w:p>

</xml_diff>